<commit_message>
Expand PI and Co-I abbreviations
</commit_message>
<xml_diff>
--- a/cv.docx
+++ b/cv.docx
@@ -2685,7 +2685,7 @@
                 <w:szCs w:val="22"/>
                 <w:color w:val="000000"/>
               </w:rPr>
-              <w:t xml:space="preserve">PI: David Scott</w:t>
+              <w:t xml:space="preserve">Principal Investigator: David Scott</w:t>
             </w:r>
             <w:r xmlns:w="http://schemas.openxmlformats.org/wordprocessingml/2006/main" xmlns:wp="http://schemas.openxmlformats.org/drawingml/2006/wordprocessingDrawing" xmlns:r="http://schemas.openxmlformats.org/officeDocument/2006/relationships" xmlns:w14="http://schemas.microsoft.com/office/word/2010/wordml">
               <w:rPr>
@@ -2711,7 +2711,7 @@
                 <w:szCs w:val="22"/>
                 <w:color w:val="000000"/>
               </w:rPr>
-              <w:t xml:space="preserve">Co-I: Laura Hilton, Leandro Venturutti</w:t>
+              <w:t xml:space="preserve">Co-Investigator: Laura Hilton, Leandro Venturutti</w:t>
             </w:r>
           </w:p>
         </w:tc>
@@ -2902,7 +2902,7 @@
                 <w:szCs w:val="22"/>
                 <w:color w:val="000000"/>
               </w:rPr>
-              <w:t xml:space="preserve">PI: Andrew Roth, Andrew Weng, Christian Steidl, David Scott, Graham Slack, Ryan Morin</w:t>
+              <w:t xml:space="preserve">Principal Investigator: Andrew Roth, Andrew Weng, Christian Steidl, David Scott, Graham Slack, Ryan Morin</w:t>
             </w:r>
             <w:r xmlns:w="http://schemas.openxmlformats.org/wordprocessingml/2006/main" xmlns:wp="http://schemas.openxmlformats.org/drawingml/2006/wordprocessingDrawing" xmlns:r="http://schemas.openxmlformats.org/officeDocument/2006/relationships" xmlns:w14="http://schemas.microsoft.com/office/word/2010/wordml">
               <w:rPr>
@@ -2928,7 +2928,7 @@
                 <w:szCs w:val="22"/>
                 <w:color w:val="000000"/>
               </w:rPr>
-              <w:t xml:space="preserve">Co-I: Laura Hilton, Adi Steif</w:t>
+              <w:t xml:space="preserve">Co-Investigator: Laura Hilton, Adi Steif</w:t>
             </w:r>
           </w:p>
         </w:tc>
@@ -3119,7 +3119,7 @@
                 <w:szCs w:val="22"/>
                 <w:color w:val="000000"/>
               </w:rPr>
-              <w:t xml:space="preserve">PI: Ryan Morin</w:t>
+              <w:t xml:space="preserve">Principal Investigator: Ryan Morin</w:t>
             </w:r>
             <w:r xmlns:w="http://schemas.openxmlformats.org/wordprocessingml/2006/main" xmlns:wp="http://schemas.openxmlformats.org/drawingml/2006/wordprocessingDrawing" xmlns:r="http://schemas.openxmlformats.org/officeDocument/2006/relationships" xmlns:w14="http://schemas.microsoft.com/office/word/2010/wordml">
               <w:rPr>
@@ -3145,7 +3145,7 @@
                 <w:szCs w:val="22"/>
                 <w:color w:val="000000"/>
               </w:rPr>
-              <w:t xml:space="preserve">Co-I: Laura Hilton, David Scott</w:t>
+              <w:t xml:space="preserve">Co-Investigator: Laura Hilton, David Scott</w:t>
             </w:r>
           </w:p>
         </w:tc>

</xml_diff>